<commit_message>
feat: add self-hosted fonts and improve accessibility tests
- Introduced self-hosted font faces for "Martian Mono" and "Instrument Sans" in globals.css.
- Updated font sizes and added new CSS properties for better typography.
- Enhanced accessibility tests for command palette, headings, and mobile menu interactions.
- Implemented tests for app behavior when localStorage is blocked.
- Added content tests to ensure UI matches expected copy and structure.
- Established security headers in vercel.json to enforce CSP and prevent framing.
- Configured Vite to resolve paths and set up testing environment.
</commit_message>
<xml_diff>
--- a/resources/Shreyash-Meshram-CV.docx
+++ b/resources/Shreyash-Meshram-CV.docx
@@ -164,7 +164,10 @@
         <w:spacing w:after="30" w:line="252" w:lineRule="auto"/>
       </w:pPr>
       <w:r>
-        <w:t xml:space="preserve">Full-Stack &amp; AI Engineer who has recently completed an MSc in Business Analytics at the University of Nottingham, building on a BE in Computer Engineering. Skilled in building Python back ends (FastAPI, Django), React interfaces and applied machine-learning pipelines from privacy-first LLM tools to computer-vision and NLP systems </w:t>
+        <w:t xml:space="preserve">Full-Stack &amp; AI Engineer who has recently completed an MSc in Business Analytics at the University of Nottingham, building on a BE in Computer Engineering. Skilled in building Python back ends (FastAPI, Django), React interfaces and applied machine-learning pipelines </w:t>
+      </w:r>
+      <w:r>
+        <w:t xml:space="preserve">from privacy-first LLM tools to computer-vision and NLP systems </w:t>
       </w:r>
       <w:r>
         <w:t>-</w:t>
@@ -225,7 +228,19 @@
         <w:rPr>
           <w:color w:val="5F676E"/>
         </w:rPr>
-        <w:t>Sep 2025 – Sep 2026</w:t>
+        <w:t xml:space="preserve">Sep 2025 </w:t>
+      </w:r>
+      <w:r>
+        <w:rPr>
+          <w:color w:val="5F676E"/>
+        </w:rPr>
+        <w:t>–</w:t>
+      </w:r>
+      <w:r>
+        <w:rPr>
+          <w:color w:val="5F676E"/>
+        </w:rPr>
+        <w:t xml:space="preserve"> Sep 2026</w:t>
       </w:r>
     </w:p>
     <w:p>
@@ -1018,7 +1033,13 @@
         <w:t>,</w:t>
       </w:r>
       <w:r>
-        <w:t xml:space="preserve"> matching DDM and well ahead of ADWIN while frozen-model SHAP and random-forest vote dominance stayed silent, as theory predicts for conditional drift.</w:t>
+        <w:t xml:space="preserve"> </w:t>
+      </w:r>
+      <w:r>
+        <w:t xml:space="preserve">matching DDM and well ahead of ADWIN </w:t>
+      </w:r>
+      <w:r>
+        <w:t>while frozen-model SHAP and random-forest vote dominance stayed silent, as theory predicts for conditional drift.</w:t>
       </w:r>
     </w:p>
     <w:p>
@@ -1086,7 +1107,17 @@
           <w:sz w:val="17"/>
           <w:szCs w:val="17"/>
         </w:rPr>
-        <w:t>Android · Firebase · Google Maps API · ECLAT   |   2026 rebuild: React Native · FastAPI · DBSCAN</w:t>
+        <w:t>Android · Firebase · Google Maps API · ECLAT   |   2026 rebuild: React Native</w:t>
+      </w:r>
+      <w:r>
+        <w:rPr>
+          <w:i/>
+          <w:iCs/>
+          <w:color w:val="5F676E"/>
+          <w:sz w:val="17"/>
+          <w:szCs w:val="17"/>
+        </w:rPr>
+        <w:t xml:space="preserve"> · FastAPI · DBSCAN</w:t>
       </w:r>
       <w:r>
         <w:rPr>
@@ -2985,7 +3016,7 @@
 </file>
 
 <file path=customXml/itemProps1.xml><?xml version="1.0" encoding="utf-8"?>
-<ds:datastoreItem xmlns:ds="http://schemas.openxmlformats.org/officeDocument/2006/customXml" ds:itemID="{BB16ACDC-B7D2-1643-9968-CE24CD947EBE}">
+<ds:datastoreItem xmlns:ds="http://schemas.openxmlformats.org/officeDocument/2006/customXml" ds:itemID="{0A92FDFB-C57B-0D40-B2B9-947F5413E66B}">
   <ds:schemaRefs>
     <ds:schemaRef ds:uri="http://schemas.openxmlformats.org/officeDocument/2006/bibliography"/>
   </ds:schemaRefs>

</xml_diff>